<commit_message>
docs: README complet et dossier de conception aligné sur le jeu final
</commit_message>
<xml_diff>
--- a/docs/Dossier conception.docx
+++ b/docs/Dossier conception.docx
@@ -73,21 +73,7 @@
           <w:sz w:val="20"/>
           <w:szCs w:val="20"/>
         </w:rPr>
-        <w:t xml:space="preserve">Enzo </w:t>
-      </w:r>
-      <w:r>
-        <w:rPr>
-          <w:sz w:val="20"/>
-          <w:szCs w:val="20"/>
-        </w:rPr>
-        <w:t>FERRIER &amp; Ethan CABANES</w:t>
-      </w:r>
-      <w:r>
-        <w:rPr>
-          <w:sz w:val="20"/>
-          <w:szCs w:val="20"/>
-        </w:rPr>
-        <w:t xml:space="preserve"> — ISIS, FIE5</w:t>
+        <w:t xml:space="preserve">Enzo FERRIER &amp; Ethan CABANES — ISIS, FIE5</w:t>
       </w:r>
     </w:p>
     <w:p>
@@ -133,7 +119,7 @@
           <w:sz w:val="20"/>
           <w:szCs w:val="20"/>
         </w:rPr>
-        <w:t>0.1 — première ébauche du dossier de conception</w:t>
+        <w:t>1.0 — version finale, alignée sur le jeu livré (octobre 2026)</w:t>
       </w:r>
     </w:p>
     <w:p>
@@ -185,7 +171,7 @@
           <w:sz w:val="22"/>
           <w:szCs w:val="22"/>
         </w:rPr>
-        <w:t>Le jeu se limite volontairement, comme demandé dans les consignes, à quatre mécaniques : la production, la récolte, les managers (qui automatisent la récolte) et les upgrades (qui appliquent des bonus). S'y ajoutent le calcul du temps écoulé hors-ligne (pour créditer la production pendant l'absence du joueur) et la possibilité d'acheter un produit par lots de 1, 5 ou 10.</w:t>
+        <w:t>Le jeu se limite volontairement, comme demandé dans les consignes, à quatre mécaniques : la production, la récolte, les managers (qui automatisent la récolte) et les upgrades (qui appliquent des bonus). S'y ajoutent le calcul du temps écoulé hors-ligne (pour créditer la production pendant l'absence du joueur), la possibilité d'acheter un produit par lots (x1, x10, x100, Max ou jusqu'au prochain palier) et le prestige par les Émissaires de la Coalition.</w:t>
       </w:r>
     </w:p>
     <w:p>
@@ -458,7 +444,7 @@
           <w:sz w:val="22"/>
           <w:szCs w:val="22"/>
         </w:rPr>
-        <w:t>À la reconnexion du joueur, le serveur calcule la production réalisée pendant son absence à partir de la date de dernière mise à jour du monde (lastupdate). Le joueur peut par ailleurs choisir d'acheter un produit par lot de 1, 5 ou 10 unités en une seule opération, le coût total étant la somme des coûts successifs sur la courbe de croissance.</w:t>
+        <w:t>À la reconnexion du joueur, le serveur calcule la production réalisée pendant son absence à partir de la date de dernière mise à jour du monde (lastupdate). Le joueur choisit par ailleurs la quantité achetée en une seule opération grâce au multiplicateur de l'en-tête : x1, x10, x100, Max (le plus possible avec les fonds disponibles) ou Next (juste assez pour atteindre le prochain palier du produit). Le coût total est la somme des coûts successifs sur la courbe de croissance.</w:t>
       </w:r>
     </w:p>
     <w:p>
@@ -669,7 +655,7 @@
           <w:sz w:val="22"/>
           <w:szCs w:val="22"/>
         </w:rPr>
-        <w:t>Les six produits suivent une progression du niveau local au niveau cosmique, à l'image de l'escalade des menaces dans Invincible. Les valeurs indiquées (coût, croissance, revenu, vitesse) sont indicatives et seront ajustées lors de l'équilibrage en phase d'implémentation.</w:t>
+        <w:t>Les six produits suivent une progression du niveau local au niveau cosmique, à l'image de l'escalade des menaces dans Invincible. Les valeurs ci-dessous sont les valeurs finales issues de l'équilibrage (voir section 6) : le coût d'achat augmente de 7 % à chaque exemplaire, le coût de départ est multiplié par 15 d'un produit au suivant, et le revenu est fixé pour qu'un exemplaire soit rentabilisé en 2 s (produit 1) à 80 s (produit 6) avant bonus.</w:t>
       </w:r>
     </w:p>
     <w:tbl>
@@ -1232,7 +1218,7 @@
                 <w:sz w:val="19"/>
                 <w:szCs w:val="19"/>
               </w:rPr>
-              <w:t>1,10</w:t>
+              <w:t>1,07</w:t>
             </w:r>
           </w:p>
         </w:tc>
@@ -1260,7 +1246,7 @@
                 <w:sz w:val="19"/>
                 <w:szCs w:val="19"/>
               </w:rPr>
-              <w:t>12 $</w:t>
+              <w:t>36 $</w:t>
             </w:r>
           </w:p>
         </w:tc>
@@ -1399,7 +1385,7 @@
                 <w:sz w:val="19"/>
                 <w:szCs w:val="19"/>
               </w:rPr>
-              <w:t>720 $</w:t>
+              <w:t>900 $</w:t>
             </w:r>
           </w:p>
         </w:tc>
@@ -1426,7 +1412,7 @@
                 <w:sz w:val="19"/>
                 <w:szCs w:val="19"/>
               </w:rPr>
-              <w:t>1,12</w:t>
+              <w:t>1,07</w:t>
             </w:r>
           </w:p>
         </w:tc>
@@ -1453,7 +1439,7 @@
                 <w:sz w:val="19"/>
                 <w:szCs w:val="19"/>
               </w:rPr>
-              <w:t>130 $</w:t>
+              <w:t>1 080 $</w:t>
             </w:r>
           </w:p>
         </w:tc>
@@ -1595,7 +1581,7 @@
                 <w:sz w:val="19"/>
                 <w:szCs w:val="19"/>
               </w:rPr>
-              <w:t>8 640 $</w:t>
+              <w:t>13 500 $</w:t>
             </w:r>
           </w:p>
         </w:tc>
@@ -1623,7 +1609,7 @@
                 <w:sz w:val="19"/>
                 <w:szCs w:val="19"/>
               </w:rPr>
-              <w:t>1,13</w:t>
+              <w:t>1,07</w:t>
             </w:r>
           </w:p>
         </w:tc>
@@ -1651,7 +1637,7 @@
                 <w:sz w:val="19"/>
                 <w:szCs w:val="19"/>
               </w:rPr>
-              <w:t>1 400 $</w:t>
+              <w:t>30 375 $</w:t>
             </w:r>
           </w:p>
         </w:tc>
@@ -1790,7 +1776,7 @@
                 <w:sz w:val="19"/>
                 <w:szCs w:val="19"/>
               </w:rPr>
-              <w:t>103 680 $</w:t>
+              <w:t>250 000 $</w:t>
             </w:r>
           </w:p>
         </w:tc>
@@ -1817,7 +1803,7 @@
                 <w:sz w:val="19"/>
                 <w:szCs w:val="19"/>
               </w:rPr>
-              <w:t>1,14</w:t>
+              <w:t>1,07</w:t>
             </w:r>
           </w:p>
         </w:tc>
@@ -1844,7 +1830,7 @@
                 <w:sz w:val="19"/>
                 <w:szCs w:val="19"/>
               </w:rPr>
-              <w:t>15 000 $</w:t>
+              <w:t>562 500 $</w:t>
             </w:r>
           </w:p>
         </w:tc>
@@ -1986,7 +1972,7 @@
                 <w:sz w:val="19"/>
                 <w:szCs w:val="19"/>
               </w:rPr>
-              <w:t>1 244 160 $</w:t>
+              <w:t>6 000 000 $</w:t>
             </w:r>
           </w:p>
         </w:tc>
@@ -2014,7 +2000,7 @@
                 <w:sz w:val="19"/>
                 <w:szCs w:val="19"/>
               </w:rPr>
-              <w:t>1,16</w:t>
+              <w:t>1,07</w:t>
             </w:r>
           </w:p>
         </w:tc>
@@ -2042,7 +2028,7 @@
                 <w:sz w:val="19"/>
                 <w:szCs w:val="19"/>
               </w:rPr>
-              <w:t>160 000 $</w:t>
+              <w:t>13 500 000 $</w:t>
             </w:r>
           </w:p>
         </w:tc>
@@ -2238,7 +2224,7 @@
           <w:sz w:val="24"/>
           <w:szCs w:val="24"/>
         </w:rPr>
-        <w:t>4.2 Seuil de déblocage des managers</w:t>
+        <w:t>4.2 Coût d'engagement des managers</w:t>
       </w:r>
     </w:p>
     <w:tbl>
@@ -2346,7 +2332,7 @@
                 <w:sz w:val="19"/>
                 <w:szCs w:val="19"/>
               </w:rPr>
-              <w:t>Seuil de quantité pour débloquer</w:t>
+              <w:t>Coût d'engagement (fonds GDA)</w:t>
             </w:r>
           </w:p>
         </w:tc>
@@ -2430,7 +2416,7 @@
                 <w:sz w:val="19"/>
                 <w:szCs w:val="19"/>
               </w:rPr>
-              <w:t>50</w:t>
+              <w:t>50 $</w:t>
             </w:r>
           </w:p>
         </w:tc>
@@ -2517,7 +2503,7 @@
                 <w:sz w:val="19"/>
                 <w:szCs w:val="19"/>
               </w:rPr>
-              <w:t>1 000</w:t>
+              <w:t>800 $</w:t>
             </w:r>
           </w:p>
         </w:tc>
@@ -2601,7 +2587,7 @@
                 <w:sz w:val="19"/>
                 <w:szCs w:val="19"/>
               </w:rPr>
-              <w:t>12 000</w:t>
+              <w:t>8 000 $</w:t>
             </w:r>
           </w:p>
         </w:tc>
@@ -2688,7 +2674,7 @@
                 <w:sz w:val="19"/>
                 <w:szCs w:val="19"/>
               </w:rPr>
-              <w:t>150 000</w:t>
+              <w:t>80 000 $</w:t>
             </w:r>
           </w:p>
         </w:tc>
@@ -2772,7 +2758,7 @@
                 <w:sz w:val="19"/>
                 <w:szCs w:val="19"/>
               </w:rPr>
-              <w:t>1 800 000</w:t>
+              <w:t>800 000 $</w:t>
             </w:r>
           </w:p>
         </w:tc>
@@ -2859,7 +2845,7 @@
                 <w:sz w:val="19"/>
                 <w:szCs w:val="19"/>
               </w:rPr>
-              <w:t>20 000 000</w:t>
+              <w:t>8 000 000 $</w:t>
             </w:r>
           </w:p>
         </w:tc>
@@ -3387,7 +3373,7 @@
                 <w:sz w:val="19"/>
                 <w:szCs w:val="19"/>
               </w:rPr>
-              <w:t>×3</w:t>
+              <w:t>×4</w:t>
             </w:r>
           </w:p>
         </w:tc>
@@ -3892,7 +3878,7 @@
                 <w:sz w:val="19"/>
                 <w:szCs w:val="19"/>
               </w:rPr>
-              <w:t>×3</w:t>
+              <w:t>×4</w:t>
             </w:r>
           </w:p>
         </w:tc>
@@ -4397,7 +4383,7 @@
                 <w:sz w:val="19"/>
                 <w:szCs w:val="19"/>
               </w:rPr>
-              <w:t>×3</w:t>
+              <w:t>×4</w:t>
             </w:r>
           </w:p>
         </w:tc>
@@ -4902,7 +4888,7 @@
                 <w:sz w:val="19"/>
                 <w:szCs w:val="19"/>
               </w:rPr>
-              <w:t>×3</w:t>
+              <w:t>×4</w:t>
             </w:r>
           </w:p>
         </w:tc>
@@ -5407,7 +5393,7 @@
                 <w:sz w:val="19"/>
                 <w:szCs w:val="19"/>
               </w:rPr>
-              <w:t>×3</w:t>
+              <w:t>×4</w:t>
             </w:r>
           </w:p>
         </w:tc>
@@ -5912,7 +5898,7 @@
                 <w:sz w:val="19"/>
                 <w:szCs w:val="19"/>
               </w:rPr>
-              <w:t>×3</w:t>
+              <w:t>×4</w:t>
             </w:r>
           </w:p>
         </w:tc>
@@ -6153,7 +6139,7 @@
                 <w:sz w:val="19"/>
                 <w:szCs w:val="19"/>
               </w:rPr>
-              <w:t>50 (chaque produit)</w:t>
+              <w:t>25 (chaque produit)</w:t>
             </w:r>
           </w:p>
         </w:tc>
@@ -6207,7 +6193,7 @@
                 <w:sz w:val="19"/>
                 <w:szCs w:val="19"/>
               </w:rPr>
-              <w:t>×2</w:t>
+              <w:t>×3</w:t>
             </w:r>
           </w:p>
         </w:tc>
@@ -6266,7 +6252,7 @@
                 <w:sz w:val="19"/>
                 <w:szCs w:val="19"/>
               </w:rPr>
-              <w:t>250 (chaque produit)</w:t>
+              <w:t>100 (chaque produit)</w:t>
             </w:r>
           </w:p>
         </w:tc>
@@ -6322,7 +6308,7 @@
                 <w:sz w:val="19"/>
                 <w:szCs w:val="19"/>
               </w:rPr>
-              <w:t>×2</w:t>
+              <w:t>×3</w:t>
             </w:r>
           </w:p>
         </w:tc>
@@ -6379,7 +6365,7 @@
                 <w:sz w:val="19"/>
                 <w:szCs w:val="19"/>
               </w:rPr>
-              <w:t>1 000 (chaque produit)</w:t>
+              <w:t>250 (chaque produit)</w:t>
             </w:r>
           </w:p>
         </w:tc>
@@ -6433,7 +6419,7 @@
                 <w:sz w:val="19"/>
                 <w:szCs w:val="19"/>
               </w:rPr>
-              <w:t>×3</w:t>
+              <w:t>×4</w:t>
             </w:r>
           </w:p>
         </w:tc>
@@ -8314,7 +8300,7 @@
                 <w:sz w:val="19"/>
                 <w:szCs w:val="19"/>
               </w:rPr>
-              <w:t>10</w:t>
+              <w:t>1</w:t>
             </w:r>
           </w:p>
         </w:tc>
@@ -8455,7 +8441,7 @@
                 <w:sz w:val="19"/>
                 <w:szCs w:val="19"/>
               </w:rPr>
-              <w:t>50</w:t>
+              <w:t>5</w:t>
             </w:r>
           </w:p>
         </w:tc>
@@ -8595,7 +8581,7 @@
                 <w:sz w:val="19"/>
                 <w:szCs w:val="19"/>
               </w:rPr>
-              <w:t>500</w:t>
+              <w:t>25</w:t>
             </w:r>
           </w:p>
         </w:tc>
@@ -8736,7 +8722,7 @@
                 <w:sz w:val="19"/>
                 <w:szCs w:val="19"/>
               </w:rPr>
-              <w:t>2 000</w:t>
+              <w:t>100</w:t>
             </w:r>
           </w:p>
         </w:tc>
@@ -8876,7 +8862,7 @@
                 <w:sz w:val="19"/>
                 <w:szCs w:val="19"/>
               </w:rPr>
-              <w:t>10 000</w:t>
+              <w:t>500</w:t>
             </w:r>
           </w:p>
         </w:tc>
@@ -8969,7 +8955,7 @@
           <w:sz w:val="22"/>
           <w:szCs w:val="22"/>
         </w:rPr>
-        <w:t>Conformément aux consignes backend, chaque produit, palier, upgrade et manager possède une icône stockée dans public/icones. La direction artistique retenue pour ces icônes :</w:t>
+        <w:t>Conformément aux consignes backend, chaque élément du monde possède une icône stockée dans public/icones : 49 images, une par élément (monde, 6 produits, 18 paliers, 3 paliers globaux, 10 upgrades, 5 angelupgrades, 6 managers). La direction artistique retenue :</w:t>
       </w:r>
     </w:p>
     <w:p>
@@ -8987,7 +8973,7 @@
           <w:sz w:val="22"/>
           <w:szCs w:val="22"/>
         </w:rPr>
-        <w:t>style bande dessinée : aplats de couleur, contours noirs marqués, légère trame de points (halftone) en fond, comme dans les planches originales d'Invincible ;</w:t>
+        <w:t>style de la série animée Invincible : personnages, lieux et objets de la série, aplats de couleur, ombres nettes et contours noirs marqués ;</w:t>
       </w:r>
     </w:p>
     <w:p>
@@ -9005,7 +8991,7 @@
           <w:sz w:val="22"/>
           <w:szCs w:val="22"/>
         </w:rPr>
-        <w:t>palette : bleu-nuit et jaune du costume d'Invincible pour les héros, gris/noir pour la GDA, bleu-vert pour l'Alliance atlante, violet pour la menace Viltrumite ;</w:t>
+        <w:t>charte graphique tirée du logo de la série : jaune #F8F80A cerclé d'un fin liseré blanc et d'un contour noir #0B0B0B, fond en dégradé diagonal du cyan #12C7E6 vers le bleu #1181AF, rouge #C8102E en accent pour les alertes et la menace viltrumite. L'interface Angular reprend la même charte, dans un style de planche de comics ;</w:t>
       </w:r>
     </w:p>
     <w:p>
@@ -9023,7 +9009,7 @@
           <w:sz w:val="22"/>
           <w:szCs w:val="22"/>
         </w:rPr>
-        <w:t>format : carrés 128×128 px, fond transparent, cohérents entre eux pour un rendu propre dans la grille du frontend Angular ;</w:t>
+        <w:t>format : images générées avec Gemini à partir d'un gabarit de prompt commun, puis converties en JPEG carrés de 256×256 px (environ 1 Mo pour l'ensemble des 49 images) ;</w:t>
       </w:r>
     </w:p>
     <w:p>
@@ -9041,7 +9027,7 @@
           <w:sz w:val="22"/>
           <w:szCs w:val="22"/>
         </w:rPr>
-        <w:t>un jeu d'icônes cohérent doit être produit avant l'intégration front, pour éviter les images provisoires (placeholders) dans la version finale.</w:t>
+        <w:t>un test automatique du backend vérifie que chaque icône référencée dans origworld.ts existe et qu'aucune n'est partagée entre deux éléments.</w:t>
       </w:r>
     </w:p>
     <w:p>
@@ -9061,7 +9047,7 @@
           <w:sz w:val="30"/>
           <w:szCs w:val="30"/>
         </w:rPr>
-        <w:t>6. Prochaines étapes</w:t>
+        <w:t>6. Équilibrage et état final</w:t>
       </w:r>
     </w:p>
     <w:p>
@@ -9079,7 +9065,7 @@
           <w:sz w:val="22"/>
           <w:szCs w:val="22"/>
         </w:rPr>
-        <w:t>Backend : implémenter le resolver et le service NestJS/GraphQL en suivant les consignes fournies, et transcrire ce contenu dans origworld.ts.</w:t>
+        <w:t>Équilibrage : la formule officielle des Émissaires exige un score cumulé de 4,4 × 10^10 pour en gagner un seul. Les premières valeurs (croissances de 1,10 à 1,16) plafonnaient vers 10^9 après trois heures de jeu, rendant le prestige impossible. Après simulation d'un joueur qui réinvestit (scripts/simuler-joueur.py), les valeurs finales permettent de posséder les six produits en moins de 10 minutes et de faire un premier reset rentable au bout de 20 à 30 minutes.</w:t>
       </w:r>
     </w:p>
     <w:p>
@@ -9097,7 +9083,7 @@
           <w:sz w:val="22"/>
           <w:szCs w:val="22"/>
         </w:rPr>
-        <w:t>Frontend : concevoir les maquettes Angular (thème visuel GDA / Invincible) à partir de ce dossier de conception.</w:t>
+        <w:t>Frontend : application Angular (signals, Apollo) avec l'interface aux couleurs d'Invincible, la production animée, les fenêtres Managers, Unlocks, Upgrades, Investors et Angel Upgrades, les messages de confirmation et un champ pour changer l'adresse du backend.</w:t>
       </w:r>
     </w:p>
     <w:p>
@@ -9115,7 +9101,7 @@
           <w:sz w:val="22"/>
           <w:szCs w:val="22"/>
         </w:rPr>
-        <w:t>Équilibrage : ajuster les valeurs numériques (coûts, croissances, seuils) après un premier test jouable.</w:t>
+        <w:t>Interopérabilité : le backend écoute sur le réseau local et le frontend peut se brancher sur le backend d'un autre groupe depuis le champ Serveur, tous les groupes partageant le même schéma GraphQL.</w:t>
       </w:r>
     </w:p>
     <w:sectPr>

</xml_diff>